<commit_message>
Create species map and streamlit app.
</commit_message>
<xml_diff>
--- a/src/output_pto_report.docx
+++ b/src/output_pto_report.docx
@@ -22,7 +22,7 @@
     </w:p>
     <w:p>
       <w:r>
-        <w:t xml:space="preserve">Assessment Date: April 06, 2026</w:t>
+        <w:t xml:space="preserve">Assessment Date: April 16, 2026</w:t>
       </w:r>
     </w:p>
     <w:p>
@@ -199,7 +199,7 @@
               <w:br/>
               <w:t xml:space="preserve">G2/S2</w:t>
               <w:br/>
-              <w:t xml:space="preserve">1B.1</w:t>
+              <w:t xml:space="preserve">CRPR: 1B.1</w:t>
             </w:r>
           </w:p>
         </w:tc>
@@ -209,7 +209,7 @@
           </w:tcPr>
           <w:p>
             <w:r>
-              <w:t xml:space="preserve"> Chaparral, Coastal scrub, Valley and foothill grassland Elevations: 15-2100ft. Blooms Jan-Aug.</w:t>
+              <w:t xml:space="preserve">Chaparral, Coastal scrub, Valley and foothill grassland Elevations: 15-2100 ft. Blooms Jan-Aug.</w:t>
             </w:r>
           </w:p>
         </w:tc>
@@ -265,7 +265,7 @@
               <w:br/>
               <w:t xml:space="preserve">G2T1/S1</w:t>
               <w:br/>
-              <w:t xml:space="preserve">1B.1</w:t>
+              <w:t xml:space="preserve">CRPR: 1B.1</w:t>
             </w:r>
           </w:p>
         </w:tc>
@@ -275,7 +275,7 @@
           </w:tcPr>
           <w:p>
             <w:r>
-              <w:t xml:space="preserve"> Coastal dunes, Coastal scrub, Marshes and swamps (edges, coastal salt, brackish) Elevations: 5-115ft. Blooms (Jun)Aug-Oct.</w:t>
+              <w:t xml:space="preserve">Coastal dunes, Coastal scrub, Marshes and swamps (edges, coastal salt, brackish) Elevations: 5-115 ft. Blooms (Jun)Aug-Oct.</w:t>
             </w:r>
           </w:p>
         </w:tc>
@@ -331,7 +331,7 @@
               <w:br/>
               <w:t xml:space="preserve">G2T1/S1</w:t>
               <w:br/>
-              <w:t xml:space="preserve">1B.1</w:t>
+              <w:t xml:space="preserve">CRPR: 1B.1</w:t>
             </w:r>
           </w:p>
         </w:tc>
@@ -341,7 +341,7 @@
           </w:tcPr>
           <w:p>
             <w:r>
-              <w:t xml:space="preserve"> Coastal bluff scrub (sandy), Coastal dunes, Coastal prairie (mesic) Elevations: 5-165ft. Blooms Mar-May.</w:t>
+              <w:t xml:space="preserve">Coastal bluff scrub (sandy), Coastal dunes, Coastal prairie (mesic) Elevations: 5-165 ft. Blooms Mar-May.</w:t>
             </w:r>
           </w:p>
         </w:tc>
@@ -397,7 +397,7 @@
               <w:br/>
               <w:t xml:space="preserve">G3/S2</w:t>
               <w:br/>
-              <w:t xml:space="preserve">1B.2</w:t>
+              <w:t xml:space="preserve">CRPR: 1B.2</w:t>
             </w:r>
           </w:p>
         </w:tc>
@@ -407,7 +407,7 @@
           </w:tcPr>
           <w:p>
             <w:r>
-              <w:t xml:space="preserve"> Coastal bluff scrub, Coastal dunes, Coastal scrub, Valley and foothill grassland Elevations: 10-1510ft. Blooms Mar-Oct.</w:t>
+              <w:t xml:space="preserve">Coastal bluff scrub, Coastal dunes, Coastal scrub, Valley and foothill grassland Elevations: 10-1510 ft. Blooms Mar-Oct.</w:t>
             </w:r>
           </w:p>
         </w:tc>
@@ -463,7 +463,7 @@
               <w:br/>
               <w:t xml:space="preserve">G4/S2</w:t>
               <w:br/>
-              <w:t xml:space="preserve">1B.2</w:t>
+              <w:t xml:space="preserve">CRPR: 1B.2</w:t>
             </w:r>
           </w:p>
         </w:tc>
@@ -473,7 +473,7 @@
           </w:tcPr>
           <w:p>
             <w:r>
-              <w:t xml:space="preserve"> Coastal bluff scrub, Coastal dunes, Coastal scrub, Playas Elevations: 0-460ft. Blooms Mar-Oct.</w:t>
+              <w:t xml:space="preserve">Coastal bluff scrub, Coastal dunes, Coastal scrub, Playas Elevations: 0-460 ft. Blooms Mar-Oct.</w:t>
             </w:r>
           </w:p>
         </w:tc>
@@ -529,7 +529,7 @@
               <w:br/>
               <w:t xml:space="preserve">G1G2/S1</w:t>
               <w:br/>
-              <w:t xml:space="preserve">1B.1</w:t>
+              <w:t xml:space="preserve">CRPR: 1B.1</w:t>
             </w:r>
           </w:p>
         </w:tc>
@@ -539,7 +539,7 @@
           </w:tcPr>
           <w:p>
             <w:r>
-              <w:t xml:space="preserve"> Chenopod scrub, Playas, Vernal pools Elevations: 80-6235ft. Blooms Jun-Oct.</w:t>
+              <w:t xml:space="preserve">Chenopod scrub, Playas, Vernal pools Elevations: 80-6235 ft. Blooms Jun-Oct.</w:t>
             </w:r>
           </w:p>
         </w:tc>
@@ -595,7 +595,7 @@
               <w:br/>
               <w:t xml:space="preserve">G5T1/S1</w:t>
               <w:br/>
-              <w:t xml:space="preserve">1B.2</w:t>
+              <w:t xml:space="preserve">CRPR: 1B.2</w:t>
             </w:r>
           </w:p>
         </w:tc>
@@ -605,7 +605,7 @@
           </w:tcPr>
           <w:p>
             <w:r>
-              <w:t xml:space="preserve"> Coastal bluff scrub, Coastal scrub Elevations: 35-655ft. Blooms Apr-Oct.</w:t>
+              <w:t xml:space="preserve">Coastal bluff scrub, Coastal scrub Elevations: 35-655 ft. Blooms Apr-Oct.</w:t>
             </w:r>
           </w:p>
         </w:tc>
@@ -661,7 +661,7 @@
               <w:br/>
               <w:t xml:space="preserve">G1/S1</w:t>
               <w:br/>
-              <w:t xml:space="preserve">1B.1</w:t>
+              <w:t xml:space="preserve">CRPR: 1B.1</w:t>
             </w:r>
           </w:p>
         </w:tc>
@@ -671,7 +671,7 @@
           </w:tcPr>
           <w:p>
             <w:r>
-              <w:t xml:space="preserve"> Chaparral, Cismontane woodland, Coastal scrub, Riparian woodland Elevations: 490-1000ft. Blooms Aug.</w:t>
+              <w:t xml:space="preserve">Chaparral, Cismontane woodland, Coastal scrub, Riparian woodland Elevations: 490-1000 ft. Blooms Aug.</w:t>
             </w:r>
           </w:p>
         </w:tc>
@@ -727,7 +727,7 @@
               <w:br/>
               <w:t xml:space="preserve">G3T3/S3</w:t>
               <w:br/>
-              <w:t xml:space="preserve">4.3</w:t>
+              <w:t xml:space="preserve">CRPR: 4.3</w:t>
             </w:r>
           </w:p>
         </w:tc>
@@ -737,7 +737,7 @@
           </w:tcPr>
           <w:p>
             <w:r>
-              <w:t xml:space="preserve"> Broadleafed upland forest, Chaparral, Cismontane woodland, Coastal scrub Elevations: 15-1395ft. Blooms May-Oct.</w:t>
+              <w:t xml:space="preserve">Broadleafed upland forest, Chaparral, Cismontane woodland, Coastal scrub Elevations: 15-1395 ft. Blooms May-Oct.</w:t>
             </w:r>
           </w:p>
         </w:tc>
@@ -793,7 +793,7 @@
               <w:br/>
               <w:t xml:space="preserve">G4/S4</w:t>
               <w:br/>
-              <w:t xml:space="preserve">4.2</w:t>
+              <w:t xml:space="preserve">CRPR: 4.2</w:t>
             </w:r>
           </w:p>
         </w:tc>
@@ -803,7 +803,7 @@
           </w:tcPr>
           <w:p>
             <w:r>
-              <w:t xml:space="preserve"> Chaparral, Coastal scrub Elevations: 35-4005ft. Blooms (Jan)Mar-Jun.</w:t>
+              <w:t xml:space="preserve">Chaparral, Coastal scrub Elevations: 35-4005 ft. Blooms (Jan)Mar-Jun.</w:t>
             </w:r>
           </w:p>
         </w:tc>
@@ -859,7 +859,7 @@
               <w:br/>
               <w:t xml:space="preserve">G4T2T3/S2S3</w:t>
               <w:br/>
-              <w:t xml:space="preserve">1B.2</w:t>
+              <w:t xml:space="preserve">CRPR: 1B.2</w:t>
             </w:r>
           </w:p>
         </w:tc>
@@ -869,7 +869,7 @@
           </w:tcPr>
           <w:p>
             <w:r>
-              <w:t xml:space="preserve"> Chaparral, Coastal scrub, Valley and foothill grassland Elevations: 1050-3280ft. Blooms Mar-Jun(Nov).</w:t>
+              <w:t xml:space="preserve">Chaparral, Coastal scrub, Valley and foothill grassland Elevations: 1050-3280 ft. Blooms Mar-Jun(Nov).</w:t>
             </w:r>
           </w:p>
         </w:tc>
@@ -925,7 +925,7 @@
               <w:br/>
               <w:t xml:space="preserve">G4/S4</w:t>
               <w:br/>
-              <w:t xml:space="preserve">4.2</w:t>
+              <w:t xml:space="preserve">CRPR: 4.2</w:t>
             </w:r>
           </w:p>
         </w:tc>
@@ -935,7 +935,7 @@
           </w:tcPr>
           <w:p>
             <w:r>
-              <w:t xml:space="preserve"> Chaparral, Cismontane woodland, Coastal scrub, Lower montane coniferous forest, Valley and foothill grassland Elevations: 330-5580ft. Blooms May-Jul.</w:t>
+              <w:t xml:space="preserve">Chaparral, Cismontane woodland, Coastal scrub, Lower montane coniferous forest, Valley and foothill grassland Elevations: 330-5580 ft. Blooms May-Jul.</w:t>
             </w:r>
           </w:p>
         </w:tc>
@@ -991,7 +991,7 @@
               <w:br/>
               <w:t xml:space="preserve">G3T2/S2</w:t>
               <w:br/>
-              <w:t xml:space="preserve">1B.1</w:t>
+              <w:t xml:space="preserve">CRPR: 1B.1</w:t>
             </w:r>
           </w:p>
         </w:tc>
@@ -1001,7 +1001,7 @@
           </w:tcPr>
           <w:p>
             <w:r>
-              <w:t xml:space="preserve"> Marshes and swamps (margins), Valley and foothill grassland (vernally mesic), Vernal pools Elevations: 0-1575ft. Blooms May-Nov.</w:t>
+              <w:t xml:space="preserve">Marshes and swamps (margins), Valley and foothill grassland (vernally mesic), Vernal pools Elevations: 0-1575 ft. Blooms May-Nov.</w:t>
             </w:r>
           </w:p>
         </w:tc>
@@ -1057,7 +1057,7 @@
               <w:br/>
               <w:t xml:space="preserve">G5T4/S4</w:t>
               <w:br/>
-              <w:t xml:space="preserve">4.3</w:t>
+              <w:t xml:space="preserve">CRPR: 4.3</w:t>
             </w:r>
           </w:p>
         </w:tc>
@@ -1067,7 +1067,7 @@
           </w:tcPr>
           <w:p>
             <w:r>
-              <w:t xml:space="preserve"> Chaparral, Closed-cone coniferous forest Elevations: 100-1970ft. Blooms Feb-May.</w:t>
+              <w:t xml:space="preserve">Chaparral, Closed-cone coniferous forest Elevations: 100-1970 ft. Blooms Feb-May.</w:t>
             </w:r>
           </w:p>
         </w:tc>
@@ -1123,7 +1123,7 @@
               <w:br/>
               <w:t xml:space="preserve">G4?T1/S1</w:t>
               <w:br/>
-              <w:t xml:space="preserve">1B.2</w:t>
+              <w:t xml:space="preserve">CRPR: 1B.2</w:t>
             </w:r>
           </w:p>
         </w:tc>
@@ -1133,7 +1133,7 @@
           </w:tcPr>
           <w:p>
             <w:r>
-              <w:t xml:space="preserve"> Coastal dunes, Marshes and swamps (coastal salt) Elevations: 0-100ft. Blooms May-Oct(Nov).</w:t>
+              <w:t xml:space="preserve">Coastal dunes, Marshes and swamps (coastal salt) Elevations: 0-100 ft. Blooms May-Oct(Nov).</w:t>
             </w:r>
           </w:p>
         </w:tc>
@@ -1189,7 +1189,7 @@
               <w:br/>
               <w:t xml:space="preserve">G3T1/S1</w:t>
               <w:br/>
-              <w:t xml:space="preserve">1B.1</w:t>
+              <w:t xml:space="preserve">CRPR: 1B.1</w:t>
             </w:r>
           </w:p>
         </w:tc>
@@ -1199,7 +1199,7 @@
           </w:tcPr>
           <w:p>
             <w:r>
-              <w:t xml:space="preserve"> Coastal scrub (sandy), Valley and foothill grassland Elevations: 490-4005ft. Blooms Apr-Jul.</w:t>
+              <w:t xml:space="preserve">Coastal scrub (sandy), Valley and foothill grassland Elevations: 490-4005 ft. Blooms Apr-Jul.</w:t>
             </w:r>
           </w:p>
         </w:tc>
@@ -1255,7 +1255,7 @@
               <w:br/>
               <w:t xml:space="preserve">G4/S4</w:t>
               <w:br/>
-              <w:t xml:space="preserve">4.2</w:t>
+              <w:t xml:space="preserve">CRPR: 4.2</w:t>
             </w:r>
           </w:p>
         </w:tc>
@@ -1265,7 +1265,7 @@
           </w:tcPr>
           <w:p>
             <w:r>
-              <w:t xml:space="preserve"> Chaparral (openings), Coastal scrub, Valley and foothill grassland Elevations: 100-2430ft. Blooms Mar-Jul.</w:t>
+              <w:t xml:space="preserve">Chaparral (openings), Coastal scrub, Valley and foothill grassland Elevations: 100-2430 ft. Blooms Mar-Jul.</w:t>
             </w:r>
           </w:p>
         </w:tc>
@@ -1321,7 +1321,7 @@
               <w:br/>
               <w:t xml:space="preserve">G2/S2</w:t>
               <w:br/>
-              <w:t xml:space="preserve">1B.2</w:t>
+              <w:t xml:space="preserve">CRPR: 1B.2</w:t>
             </w:r>
           </w:p>
         </w:tc>
@@ -1331,7 +1331,7 @@
           </w:tcPr>
           <w:p>
             <w:r>
-              <w:t xml:space="preserve"> Chaparral, Coastal scrub Elevations: 920-2495ft. Blooms Jul-Nov.</w:t>
+              <w:t xml:space="preserve">Chaparral, Coastal scrub Elevations: 920-2495 ft. Blooms Jul-Nov.</w:t>
             </w:r>
           </w:p>
         </w:tc>
@@ -1387,7 +1387,7 @@
               <w:br/>
               <w:t xml:space="preserve">G3G4/S3S4</w:t>
               <w:br/>
-              <w:t xml:space="preserve">4.2</w:t>
+              <w:t xml:space="preserve">CRPR: 4.2</w:t>
             </w:r>
           </w:p>
         </w:tc>
@@ -1397,7 +1397,7 @@
           </w:tcPr>
           <w:p>
             <w:r>
-              <w:t xml:space="preserve"> Chaparral, Cismontane woodland, Coastal scrub, Valley and foothill grassland Elevations: 165-1640ft. Blooms (Jan)Mar-Jul.</w:t>
+              <w:t xml:space="preserve">Chaparral, Cismontane woodland, Coastal scrub, Valley and foothill grassland Elevations: 165-1640 ft. Blooms (Jan)Mar-Jul.</w:t>
             </w:r>
           </w:p>
         </w:tc>
@@ -1453,7 +1453,7 @@
               <w:br/>
               <w:t xml:space="preserve">G1/S1</w:t>
               <w:br/>
-              <w:t xml:space="preserve">1B.1</w:t>
+              <w:t xml:space="preserve">CRPR: 1B.1</w:t>
             </w:r>
           </w:p>
         </w:tc>
@@ -1463,7 +1463,7 @@
           </w:tcPr>
           <w:p>
             <w:r>
-              <w:t xml:space="preserve"> Coastal dunes, Coastal scrub (sandy) Elevations: 10-165ft. Blooms Mar-May.</w:t>
+              <w:t xml:space="preserve">Coastal dunes, Coastal scrub (sandy) Elevations: 10-165 ft. Blooms Mar-May.</w:t>
             </w:r>
           </w:p>
         </w:tc>
@@ -1519,7 +1519,7 @@
               <w:br/>
               <w:t xml:space="preserve">G1/S1</w:t>
               <w:br/>
-              <w:t xml:space="preserve">1B.1</w:t>
+              <w:t xml:space="preserve">CRPR: 1B.1</w:t>
             </w:r>
           </w:p>
         </w:tc>
@@ -1529,7 +1529,7 @@
           </w:tcPr>
           <w:p>
             <w:r>
-              <w:t xml:space="preserve"> Chaparral, Cismontane woodland, Coastal scrub (alluvial fans) Elevations: 655-2495ft. Blooms Apr-Jun.</w:t>
+              <w:t xml:space="preserve">Chaparral, Cismontane woodland, Coastal scrub (alluvial fans) Elevations: 655-2495 ft. Blooms Apr-Jun.</w:t>
             </w:r>
           </w:p>
         </w:tc>
@@ -1585,7 +1585,7 @@
               <w:br/>
               <w:t xml:space="preserve">G3T2/S2</w:t>
               <w:br/>
-              <w:t xml:space="preserve">1B.1</w:t>
+              <w:t xml:space="preserve">CRPR: 1B.1</w:t>
             </w:r>
           </w:p>
         </w:tc>
@@ -1595,7 +1595,7 @@
           </w:tcPr>
           <w:p>
             <w:r>
-              <w:t xml:space="preserve"> Chaparral, Coastal bluff scrub, Coastal scrub, Valley and foothill grassland Elevations: 15-1475ft. Blooms Apr-Jun.</w:t>
+              <w:t xml:space="preserve">Chaparral, Coastal bluff scrub, Coastal scrub, Valley and foothill grassland Elevations: 15-1475 ft. Blooms Apr-Jun.</w:t>
             </w:r>
           </w:p>
         </w:tc>
@@ -1651,7 +1651,7 @@
               <w:br/>
               <w:t xml:space="preserve">G5T2/S2</w:t>
               <w:br/>
-              <w:t xml:space="preserve">1B.2</w:t>
+              <w:t xml:space="preserve">CRPR: 1B.2</w:t>
             </w:r>
           </w:p>
         </w:tc>
@@ -1661,7 +1661,7 @@
           </w:tcPr>
           <w:p>
             <w:r>
-              <w:t xml:space="preserve"> Chaparral Elevations: 490-1705ft. Blooms Apr-Jul.</w:t>
+              <w:t xml:space="preserve">Chaparral Elevations: 490-1705 ft. Blooms Apr-Jul.</w:t>
             </w:r>
           </w:p>
         </w:tc>
@@ -1717,7 +1717,7 @@
               <w:br/>
               <w:t xml:space="preserve">G5T1/S1</w:t>
               <w:br/>
-              <w:t xml:space="preserve">1B.1</w:t>
+              <w:t xml:space="preserve">CRPR: 1B.1</w:t>
             </w:r>
           </w:p>
         </w:tc>
@@ -1727,7 +1727,7 @@
           </w:tcPr>
           <w:p>
             <w:r>
-              <w:t xml:space="preserve"> Chaparral, Coastal scrub Elevations: 490-5495ft. Blooms Mar-Jun.</w:t>
+              <w:t xml:space="preserve">Chaparral, Coastal scrub Elevations: 490-5495 ft. Blooms Mar-Jun.</w:t>
             </w:r>
           </w:p>
         </w:tc>
@@ -1783,7 +1783,7 @@
               <w:br/>
               <w:t xml:space="preserve">G2/S2</w:t>
               <w:br/>
-              <w:t xml:space="preserve">1B.2</w:t>
+              <w:t xml:space="preserve">CRPR: 1B.2</w:t>
             </w:r>
           </w:p>
         </w:tc>
@@ -1793,7 +1793,7 @@
           </w:tcPr>
           <w:p>
             <w:r>
-              <w:t xml:space="preserve"> Chaparral, Coastal scrub, Valley and foothill grassland Elevations: 50-2590ft. Blooms Apr-Jul.</w:t>
+              <w:t xml:space="preserve">Chaparral, Coastal scrub, Valley and foothill grassland Elevations: 50-2590 ft. Blooms Apr-Jul.</w:t>
             </w:r>
           </w:p>
         </w:tc>
@@ -1849,7 +1849,7 @@
               <w:br/>
               <w:t xml:space="preserve">G4/S4</w:t>
               <w:br/>
-              <w:t xml:space="preserve">4.3</w:t>
+              <w:t xml:space="preserve">CRPR: 4.3</w:t>
             </w:r>
           </w:p>
         </w:tc>
@@ -1859,7 +1859,7 @@
           </w:tcPr>
           <w:p>
             <w:r>
-              <w:t xml:space="preserve"> Cismontane woodland Elevations: 655-4005ft. Blooms May-Jul.</w:t>
+              <w:t xml:space="preserve">Cismontane woodland Elevations: 655-4005 ft. Blooms May-Jul.</w:t>
             </w:r>
           </w:p>
         </w:tc>
@@ -1915,7 +1915,7 @@
               <w:br/>
               <w:t xml:space="preserve">G4T1/S1</w:t>
               <w:br/>
-              <w:t xml:space="preserve">1B.1</w:t>
+              <w:t xml:space="preserve">CRPR: 1B.1</w:t>
             </w:r>
           </w:p>
         </w:tc>
@@ -1925,7 +1925,7 @@
           </w:tcPr>
           <w:p>
             <w:r>
-              <w:t xml:space="preserve"> Chaparral (maritime), Cismontane woodland, Coastal scrub Elevations: 230-2660ft. Blooms Feb-Jul(Sep).</w:t>
+              <w:t xml:space="preserve">Chaparral (maritime), Cismontane woodland, Coastal scrub Elevations: 230-2660 ft. Blooms Feb-Jul(Sep).</w:t>
             </w:r>
           </w:p>
         </w:tc>
@@ -1981,7 +1981,7 @@
               <w:br/>
               <w:t xml:space="preserve">G3G5T2T3/S2</w:t>
               <w:br/>
-              <w:t xml:space="preserve">1B.2</w:t>
+              <w:t xml:space="preserve">CRPR: 1B.2</w:t>
             </w:r>
           </w:p>
         </w:tc>
@@ -1991,7 +1991,7 @@
           </w:tcPr>
           <w:p>
             <w:r>
-              <w:t xml:space="preserve"> Chaparral, Coastal scrub (often disturbed areas, sandy) Elevations: 35-820ft. Blooms Apr-Nov.</w:t>
+              <w:t xml:space="preserve">Chaparral, Coastal scrub (often disturbed areas, sandy) Elevations: 35-820 ft. Blooms Apr-Nov.</w:t>
             </w:r>
           </w:p>
         </w:tc>
@@ -2047,7 +2047,7 @@
               <w:br/>
               <w:t xml:space="preserve">G4/S4</w:t>
               <w:br/>
-              <w:t xml:space="preserve">4.2</w:t>
+              <w:t xml:space="preserve">CRPR: 4.2</w:t>
             </w:r>
           </w:p>
         </w:tc>
@@ -2057,7 +2057,7 @@
           </w:tcPr>
           <w:p>
             <w:r>
-              <w:t xml:space="preserve"> Chaparral, Cismontane woodland, Coastal scrub, Riparian woodland Elevations: 165-2955ft. Blooms Mar-Aug.</w:t>
+              <w:t xml:space="preserve">Chaparral, Cismontane woodland, Coastal scrub, Riparian woodland Elevations: 165-2955 ft. Blooms Mar-Aug.</w:t>
             </w:r>
           </w:p>
         </w:tc>
@@ -2113,7 +2113,7 @@
               <w:br/>
               <w:t xml:space="preserve">G5T5/S4</w:t>
               <w:br/>
-              <w:t xml:space="preserve">4.2</w:t>
+              <w:t xml:space="preserve">CRPR: 4.2</w:t>
             </w:r>
           </w:p>
         </w:tc>
@@ -2123,7 +2123,7 @@
           </w:tcPr>
           <w:p>
             <w:r>
-              <w:t xml:space="preserve"> Coastal dunes (mesic), Coastal scrub, Marshes and swamps (coastal salt), Meadows and seeps (alkaline seeps) Elevations: 10-2955ft. Blooms (Mar)May-Jun.</w:t>
+              <w:t xml:space="preserve">Coastal dunes (mesic), Coastal scrub, Marshes and swamps (coastal salt), Meadows and seeps (alkaline seeps) Elevations: 10-2955 ft. Blooms (Mar)May-Jun.</w:t>
             </w:r>
           </w:p>
         </w:tc>
@@ -2179,7 +2179,7 @@
               <w:br/>
               <w:t xml:space="preserve">G4T2/S2</w:t>
               <w:br/>
-              <w:t xml:space="preserve">1B.1</w:t>
+              <w:t xml:space="preserve">CRPR: 1B.1</w:t>
             </w:r>
           </w:p>
         </w:tc>
@@ -2189,7 +2189,7 @@
           </w:tcPr>
           <w:p>
             <w:r>
-              <w:t xml:space="preserve"> Marshes and swamps (coastal salt), Playas, Vernal pools Elevations: 5-4005ft. Blooms Feb-Jun.</w:t>
+              <w:t xml:space="preserve">Marshes and swamps (coastal salt), Playas, Vernal pools Elevations: 5-4005 ft. Blooms Feb-Jun.</w:t>
             </w:r>
           </w:p>
         </w:tc>
@@ -2245,7 +2245,7 @@
               <w:br/>
               <w:t xml:space="preserve">G3/S3</w:t>
               <w:br/>
-              <w:t xml:space="preserve">4.2</w:t>
+              <w:t xml:space="preserve">CRPR: 4.2</w:t>
             </w:r>
           </w:p>
         </w:tc>
@@ -2255,7 +2255,7 @@
           </w:tcPr>
           <w:p>
             <w:r>
-              <w:t xml:space="preserve"> Chaparral Elevations: 65-4300ft. Blooms Mar-Oct.</w:t>
+              <w:t xml:space="preserve">Chaparral Elevations: 65-4300 ft. Blooms Mar-Oct.</w:t>
             </w:r>
           </w:p>
         </w:tc>
@@ -2311,7 +2311,7 @@
               <w:br/>
               <w:t xml:space="preserve">G4T4?/S4?</w:t>
               <w:br/>
-              <w:t xml:space="preserve">4.2</w:t>
+              <w:t xml:space="preserve">CRPR: 4.2</w:t>
             </w:r>
           </w:p>
         </w:tc>
@@ -2321,7 +2321,7 @@
           </w:tcPr>
           <w:p>
             <w:r>
-              <w:t xml:space="preserve"> Chaparral, Cismontane woodland, Coastal scrub, Lower montane coniferous forest, Riparian woodland Elevations: 100-5905ft. Blooms Mar-Jul(Aug).</w:t>
+              <w:t xml:space="preserve">Chaparral, Cismontane woodland, Coastal scrub, Lower montane coniferous forest, Riparian woodland Elevations: 100-5905 ft. Blooms Mar-Jul(Aug).</w:t>
             </w:r>
           </w:p>
         </w:tc>
@@ -2377,7 +2377,7 @@
               <w:br/>
               <w:t xml:space="preserve">G2/S2</w:t>
               <w:br/>
-              <w:t xml:space="preserve">1B.2</w:t>
+              <w:t xml:space="preserve">CRPR: 1B.2</w:t>
             </w:r>
           </w:p>
         </w:tc>
@@ -2387,7 +2387,7 @@
           </w:tcPr>
           <w:p>
             <w:r>
-              <w:t xml:space="preserve"> Chaparral, Cismontane woodland, Coastal scrub, Riparian woodland Elevations: 605-3740ft. Blooms Jun-Jan.</w:t>
+              <w:t xml:space="preserve">Chaparral, Cismontane woodland, Coastal scrub, Riparian woodland Elevations: 605-3740 ft. Blooms Jun-Jan.</w:t>
             </w:r>
           </w:p>
         </w:tc>
@@ -2443,7 +2443,7 @@
               <w:br/>
               <w:t xml:space="preserve">G4T3/S3</w:t>
               <w:br/>
-              <w:t xml:space="preserve">1B.3</w:t>
+              <w:t xml:space="preserve">CRPR: 1B.3</w:t>
             </w:r>
           </w:p>
         </w:tc>
@@ -2453,7 +2453,7 @@
           </w:tcPr>
           <w:p>
             <w:r>
-              <w:t xml:space="preserve"> Chaparral, Cismontane woodland Elevations: 165-5005ft. Blooms (Apr)May-Aug(Sep-Dec).</w:t>
+              <w:t xml:space="preserve">Chaparral, Cismontane woodland Elevations: 165-5005 ft. Blooms (Apr)May-Aug(Sep-Dec).</w:t>
             </w:r>
           </w:p>
         </w:tc>
@@ -2509,7 +2509,7 @@
               <w:br/>
               <w:t xml:space="preserve">G4G5/S1S2</w:t>
               <w:br/>
-              <w:t xml:space="preserve">2B.2</w:t>
+              <w:t xml:space="preserve">CRPR: 2B.2</w:t>
             </w:r>
           </w:p>
         </w:tc>
@@ -2519,7 +2519,7 @@
           </w:tcPr>
           <w:p>
             <w:r>
-              <w:t xml:space="preserve"> Marshes and swamps (lake margins, riverbanks) Elevations: 15-1640ft. Blooms Jan-Jul.</w:t>
+              <w:t xml:space="preserve">Marshes and swamps (lake margins, riverbanks) Elevations: 15-1640 ft. Blooms Jan-Jul.</w:t>
             </w:r>
           </w:p>
         </w:tc>
@@ -2575,7 +2575,7 @@
               <w:br/>
               <w:t xml:space="preserve">G2/S2</w:t>
               <w:br/>
-              <w:t xml:space="preserve">1B.1</w:t>
+              <w:t xml:space="preserve">CRPR: 1B.1</w:t>
             </w:r>
           </w:p>
         </w:tc>
@@ -2585,7 +2585,7 @@
           </w:tcPr>
           <w:p>
             <w:r>
-              <w:t xml:space="preserve"> Chaparral (openings), Coastal scrub (openings), Valley and foothill grassland Elevations: 900-2035ft. Blooms May-Jul.</w:t>
+              <w:t xml:space="preserve">Chaparral (openings), Coastal scrub (openings), Valley and foothill grassland Elevations: 900-2035 ft. Blooms May-Jul.</w:t>
             </w:r>
           </w:p>
         </w:tc>
@@ -2641,7 +2641,7 @@
               <w:br/>
               <w:t xml:space="preserve">G3/S3</w:t>
               <w:br/>
-              <w:t xml:space="preserve">1B.2</w:t>
+              <w:t xml:space="preserve">CRPR: 1B.2</w:t>
             </w:r>
           </w:p>
         </w:tc>
@@ -2651,7 +2651,7 @@
           </w:tcPr>
           <w:p>
             <w:r>
-              <w:t xml:space="preserve"> Chaparral, Coastal scrub Elevations: 460-4185ft. Blooms (Mar)May-Jul.</w:t>
+              <w:t xml:space="preserve">Chaparral, Coastal scrub Elevations: 460-4185 ft. Blooms (Mar)May-Jul.</w:t>
             </w:r>
           </w:p>
         </w:tc>
@@ -2707,7 +2707,7 @@
               <w:br/>
               <w:t xml:space="preserve">G5T4/S2</w:t>
               <w:br/>
-              <w:t xml:space="preserve">2B.2</w:t>
+              <w:t xml:space="preserve">CRPR: 2B.2</w:t>
             </w:r>
           </w:p>
         </w:tc>
@@ -2717,7 +2717,7 @@
           </w:tcPr>
           <w:p>
             <w:r>
-              <w:t xml:space="preserve"> Meadows and seeps (seeps, streams) Elevations: 165-2000ft. Blooms Jan-Sep.</w:t>
+              <w:t xml:space="preserve">Meadows and seeps (seeps, streams) Elevations: 165-2000 ft. Blooms Jan-Sep.</w:t>
             </w:r>
           </w:p>
         </w:tc>
@@ -2773,7 +2773,7 @@
               <w:br/>
               <w:t xml:space="preserve">G1/S1</w:t>
               <w:br/>
-              <w:t xml:space="preserve">1B.1</w:t>
+              <w:t xml:space="preserve">CRPR: 1B.1</w:t>
             </w:r>
           </w:p>
         </w:tc>
@@ -2783,7 +2783,7 @@
           </w:tcPr>
           <w:p>
             <w:r>
-              <w:t xml:space="preserve"> Chaparral (openings), Coastal scrub, Valley and foothill grassland Elevations: 100-2265ft. Blooms (Feb)Mar-Aug.</w:t>
+              <w:t xml:space="preserve">Chaparral (openings), Coastal scrub, Valley and foothill grassland Elevations: 100-2265 ft. Blooms (Feb)Mar-Aug.</w:t>
             </w:r>
           </w:p>
         </w:tc>
@@ -2839,7 +2839,7 @@
               <w:br/>
               <w:t xml:space="preserve">G3/S3</w:t>
               <w:br/>
-              <w:t xml:space="preserve">1B.1</w:t>
+              <w:t xml:space="preserve">CRPR: 1B.1</w:t>
             </w:r>
           </w:p>
         </w:tc>
@@ -2849,7 +2849,7 @@
           </w:tcPr>
           <w:p>
             <w:r>
-              <w:t xml:space="preserve"> Chaparral, Closed-cone coniferous forest, Coastal scrub Elevations: 50-1310ft. Blooms Feb-Apr(May-Aug).</w:t>
+              <w:t xml:space="preserve">Chaparral, Closed-cone coniferous forest, Coastal scrub Elevations: 50-1310 ft. Blooms Feb-Apr(May-Aug).</w:t>
             </w:r>
           </w:p>
         </w:tc>
@@ -2905,7 +2905,7 @@
               <w:br/>
               <w:t xml:space="preserve">G5T4/S4</w:t>
               <w:br/>
-              <w:t xml:space="preserve">4.3</w:t>
+              <w:t xml:space="preserve">CRPR: 4.3</w:t>
             </w:r>
           </w:p>
         </w:tc>
@@ -2915,7 +2915,7 @@
           </w:tcPr>
           <w:p>
             <w:r>
-              <w:t xml:space="preserve"> Chaparral, Cismontane woodland, Riparian woodland Elevations: 330-3280ft. Blooms May-Aug.</w:t>
+              <w:t xml:space="preserve">Chaparral, Cismontane woodland, Riparian woodland Elevations: 330-3280 ft. Blooms May-Aug.</w:t>
             </w:r>
           </w:p>
         </w:tc>
@@ -2971,7 +2971,7 @@
               <w:br/>
               <w:t xml:space="preserve">G4/S4</w:t>
               <w:br/>
-              <w:t xml:space="preserve">4.2</w:t>
+              <w:t xml:space="preserve">CRPR: 4.2</w:t>
             </w:r>
           </w:p>
         </w:tc>
@@ -2981,7 +2981,7 @@
           </w:tcPr>
           <w:p>
             <w:r>
-              <w:t xml:space="preserve"> Chaparral, Coastal scrub Elevations: 65-3935ft. Blooms Mar-Jul(Aug).</w:t>
+              <w:t xml:space="preserve">Chaparral, Coastal scrub Elevations: 65-3935 ft. Blooms Mar-Jul(Aug).</w:t>
             </w:r>
           </w:p>
         </w:tc>
@@ -3037,7 +3037,7 @@
               <w:br/>
               <w:t xml:space="preserve">G3/S3</w:t>
               <w:br/>
-              <w:t xml:space="preserve">1B.2</w:t>
+              <w:t xml:space="preserve">CRPR: 1B.2</w:t>
             </w:r>
           </w:p>
         </w:tc>
@@ -3047,7 +3047,7 @@
           </w:tcPr>
           <w:p>
             <w:r>
-              <w:t xml:space="preserve"> Marshes and swamps (shallow freshwater) Elevations: 0-2135ft. Blooms May-Oct(Nov).</w:t>
+              <w:t xml:space="preserve">Marshes and swamps (shallow freshwater) Elevations: 0-2135 ft. Blooms May-Oct(Nov).</w:t>
             </w:r>
           </w:p>
         </w:tc>
@@ -3103,7 +3103,7 @@
               <w:br/>
               <w:t xml:space="preserve">G4/S2</w:t>
               <w:br/>
-              <w:t xml:space="preserve">2B.2</w:t>
+              <w:t xml:space="preserve">CRPR: 2B.2</w:t>
             </w:r>
           </w:p>
         </w:tc>
@@ -3113,7 +3113,7 @@
           </w:tcPr>
           <w:p>
             <w:r>
-              <w:t xml:space="preserve"> Chaparral, Coastal scrub, Lower montane coniferous forest, Mojavean desert scrub, Playas Elevations: 50-5020ft. Blooms Mar-Jun.</w:t>
+              <w:t xml:space="preserve">Chaparral, Coastal scrub, Lower montane coniferous forest, Mojavean desert scrub, Playas Elevations: 50-5020 ft. Blooms Mar-Jun.</w:t>
             </w:r>
           </w:p>
         </w:tc>
@@ -3169,7 +3169,7 @@
               <w:br/>
               <w:t xml:space="preserve">G2/S2</w:t>
               <w:br/>
-              <w:t xml:space="preserve">1B.3</w:t>
+              <w:t xml:space="preserve">CRPR: 1B.3</w:t>
             </w:r>
           </w:p>
         </w:tc>
@@ -3179,7 +3179,7 @@
           </w:tcPr>
           <w:p>
             <w:r>
-              <w:t xml:space="preserve"> Broadleafed upland forest, Chaparral, Cismontane woodland, Lower montane coniferous forest, Riparian woodland Elevations: 985-6595ft. Blooms Jun-Oct.</w:t>
+              <w:t xml:space="preserve">Broadleafed upland forest, Chaparral, Cismontane woodland, Lower montane coniferous forest, Riparian woodland Elevations: 985-6595 ft. Blooms Jun-Oct.</w:t>
             </w:r>
           </w:p>
         </w:tc>

</xml_diff>